<commit_message>
Alinear la iteración 1 con la guía SDD (Spec-Driven Development)
- Constitución 1.1.0: nivel spec-anchored, stack, prohibiciones y puertas de revisión G0-G5
- spec.md: requisitos en formato EARS, criterios de aceptación Gherkin, fuera de alcance,
  preguntas abiertas y FR-012 (spec drift detectado)
- plan.md: decisiones ADR con alternativas descartadas y requisitos citados
- tasks.md: criterio "Hecho cuando" por tarea, matriz requisito -> tarea y T024 (NFR-002)
- Pruebas nombradas con el ID del requisito y prueba automatizada de rendimiento
- Auditoría con trazabilidad completa, validación manual y revisión de antipatrones
- AGENTS.md, CLAUDE.md y README que resume todos los entregables

Co-Authored-By: Claude Opus 5.5 <noreply@anthropic.com>
</commit_message>
<xml_diff>
--- a/entregables/01_Constitucion_speckit-constitution.docx
+++ b/entregables/01_Constitucion_speckit-constitution.docx
@@ -25,7 +25,23 @@
           <w:i/>
           <w:color w:val="555F6D"/>
         </w:rPr>
-        <w:t>Comando SDD:</w:t>
+        <w:t>Fase SDD:</w:t>
+      </w:r>
+      <w:r>
+        <w:rPr>
+          <w:b w:val="0"/>
+          <w:i/>
+          <w:color w:val="555F6D"/>
+        </w:rPr>
+        <w:t xml:space="preserve"> 0 – Principios del proyecto | </w:t>
+      </w:r>
+      <w:r>
+        <w:rPr>
+          <w:b/>
+          <w:i/>
+          <w:color w:val="555F6D"/>
+        </w:rPr>
+        <w:t>Comando Spec Kit:</w:t>
       </w:r>
       <w:r>
         <w:rPr>
@@ -93,7 +109,7 @@
           <w:i/>
           <w:color w:val="555F6D"/>
         </w:rPr>
-        <w:t xml:space="preserve"> 1.0.0 | </w:t>
+        <w:t xml:space="preserve"> 1.1.0 | </w:t>
       </w:r>
       <w:r>
         <w:rPr>
@@ -125,7 +141,7 @@
           <w:i/>
           <w:color w:val="555F6D"/>
         </w:rPr>
-        <w:t xml:space="preserve"> 2026-10-21</w:t>
+        <w:t xml:space="preserve"> 2026-10-22</w:t>
       </w:r>
     </w:p>
     <w:p>
@@ -147,21 +163,102 @@
           <w:b w:val="0"/>
           <w:i w:val="0"/>
         </w:rPr>
-        <w:t xml:space="preserve">TaskFlow es una API REST para que estudiantes universitarios registren y den seguimiento a sus tareas académicas (entregas, materias, prioridades y estados). Esta constitución reúne las reglas globales e inviolables que el agente de IA y el equipo deben cumplir en </w:t>
+        <w:t xml:space="preserve">TaskFlow es una API REST para que estudiantes universitarios registren y den seguimiento a sus tareas académicas. Esta constitución reúne las reglas </w:t>
       </w:r>
       <w:r>
         <w:rPr>
           <w:b/>
           <w:i w:val="0"/>
         </w:rPr>
-        <w:t>cada</w:t>
+        <w:t>globales y no negociables</w:t>
       </w:r>
       <w:r>
         <w:rPr>
           <w:b w:val="0"/>
           <w:i w:val="0"/>
         </w:rPr>
-        <w:t xml:space="preserve"> fase del flujo SDD: especificar, planificar, generar tareas, implementar y converger. Se define una sola vez por proyecto y solo se cambia mediante el proceso de enmienda descrito al final.</w:t>
+        <w:t xml:space="preserve"> que aplican a todo el proyecto, sin importar la funcionalidad. La IA y el equipo deben respetarlas en cada fase: especificar, diseñar, generar tareas, implementar y validar.</w:t>
+      </w:r>
+    </w:p>
+    <w:p>
+      <w:pPr>
+        <w:ind w:left="340"/>
+      </w:pPr>
+      <w:r>
+        <w:rPr>
+          <w:b w:val="0"/>
+          <w:i/>
+          <w:color w:val="555F6D"/>
+        </w:rPr>
+        <w:t>Idea central de SDD:</w:t>
+      </w:r>
+      <w:r>
+        <w:rPr>
+          <w:b w:val="0"/>
+          <w:i/>
+          <w:color w:val="555F6D"/>
+        </w:rPr>
+        <w:t xml:space="preserve"> decidir qué código debe existir es el trabajo real; escribirlo es cada vez más automatizable. Por eso las decisiones se toman </w:t>
+      </w:r>
+      <w:r>
+        <w:rPr>
+          <w:b/>
+          <w:i/>
+          <w:color w:val="555F6D"/>
+        </w:rPr>
+        <w:t>por escrito y antes</w:t>
+      </w:r>
+      <w:r>
+        <w:rPr>
+          <w:b w:val="0"/>
+          <w:i/>
+          <w:color w:val="555F6D"/>
+        </w:rPr>
+        <w:t xml:space="preserve"> de que el agente toque un archivo.</w:t>
+      </w:r>
+    </w:p>
+    <w:p>
+      <w:r>
+        <w:rPr>
+          <w:b/>
+          <w:i w:val="0"/>
+        </w:rPr>
+        <w:t>Nivel de rigor adoptado:</w:t>
+      </w:r>
+      <w:r>
+        <w:rPr>
+          <w:b w:val="0"/>
+          <w:i w:val="0"/>
+        </w:rPr>
+        <w:t xml:space="preserve"> </w:t>
+      </w:r>
+      <w:r>
+        <w:rPr>
+          <w:b/>
+          <w:i w:val="0"/>
+        </w:rPr>
+        <w:t>Spec-anchored</w:t>
+      </w:r>
+      <w:r>
+        <w:rPr>
+          <w:b w:val="0"/>
+          <w:i w:val="0"/>
+        </w:rPr>
+        <w:t xml:space="preserve"> (anclado a la especificación). La especificación se mantiene viva durante toda la vida de la funcionalidad: cuando cambia el comportamiento, </w:t>
+      </w:r>
+      <w:r>
+        <w:rPr>
+          <w:b/>
+          <w:i w:val="0"/>
+        </w:rPr>
+        <w:t>primero se edita la spec y después el código</w:t>
+      </w:r>
+      <w:r>
+        <w:rPr>
+          <w:b w:val="0"/>
+          <w:i w:val="0"/>
+        </w:rPr>
+        <w:t>.</w:t>
       </w:r>
     </w:p>
     <w:p>
@@ -174,7 +271,323 @@
           <w:i w:val="0"/>
           <w:color w:val="1F3A5F"/>
         </w:rPr>
-        <w:t>Principios fundamentales</w:t>
+        <w:t>1. Stack</w:t>
+      </w:r>
+    </w:p>
+    <w:tbl>
+      <w:tblPr>
+        <w:tblStyle w:val="TableGrid"/>
+        <w:tblW w:type="auto" w:w="0"/>
+        <w:jc w:val="center"/>
+        <w:tblLook w:firstColumn="1" w:firstRow="1" w:lastColumn="0" w:lastRow="0" w:noHBand="0" w:noVBand="1" w:val="04A0"/>
+      </w:tblPr>
+      <w:tblGrid>
+        <w:gridCol w:w="4873"/>
+        <w:gridCol w:w="4873"/>
+      </w:tblGrid>
+      <w:tr>
+        <w:tc>
+          <w:tcPr>
+            <w:tcW w:type="dxa" w:w="4873"/>
+            <w:shd w:val="clear" w:color="auto" w:fill="1F3A5F"/>
+          </w:tcPr>
+          <w:p>
+            <w:r>
+              <w:rPr>
+                <w:b/>
+                <w:i w:val="0"/>
+                <w:color w:val="FFFFFF"/>
+                <w:sz w:val="19"/>
+              </w:rPr>
+              <w:t>Componente</w:t>
+            </w:r>
+          </w:p>
+        </w:tc>
+        <w:tc>
+          <w:tcPr>
+            <w:tcW w:type="dxa" w:w="4873"/>
+            <w:shd w:val="clear" w:color="auto" w:fill="1F3A5F"/>
+          </w:tcPr>
+          <w:p>
+            <w:r>
+              <w:rPr>
+                <w:b/>
+                <w:i w:val="0"/>
+                <w:color w:val="FFFFFF"/>
+                <w:sz w:val="19"/>
+              </w:rPr>
+              <w:t>Decisión</w:t>
+            </w:r>
+          </w:p>
+        </w:tc>
+      </w:tr>
+      <w:tr>
+        <w:tc>
+          <w:tcPr>
+            <w:tcW w:type="dxa" w:w="4873"/>
+          </w:tcPr>
+          <w:p>
+            <w:r>
+              <w:rPr>
+                <w:b w:val="0"/>
+                <w:i w:val="0"/>
+                <w:sz w:val="19"/>
+              </w:rPr>
+              <w:t>Lenguaje</w:t>
+            </w:r>
+          </w:p>
+        </w:tc>
+        <w:tc>
+          <w:tcPr>
+            <w:tcW w:type="dxa" w:w="4873"/>
+          </w:tcPr>
+          <w:p>
+            <w:r>
+              <w:rPr>
+                <w:b w:val="0"/>
+                <w:i w:val="0"/>
+                <w:sz w:val="19"/>
+              </w:rPr>
+              <w:t>JavaScript (CommonJS)</w:t>
+            </w:r>
+          </w:p>
+        </w:tc>
+      </w:tr>
+      <w:tr>
+        <w:tc>
+          <w:tcPr>
+            <w:tcW w:type="dxa" w:w="4873"/>
+            <w:shd w:val="clear" w:color="auto" w:fill="EEF2F7"/>
+          </w:tcPr>
+          <w:p>
+            <w:r>
+              <w:rPr>
+                <w:b w:val="0"/>
+                <w:i w:val="0"/>
+                <w:sz w:val="19"/>
+              </w:rPr>
+              <w:t>Entorno</w:t>
+            </w:r>
+          </w:p>
+        </w:tc>
+        <w:tc>
+          <w:tcPr>
+            <w:tcW w:type="dxa" w:w="4873"/>
+            <w:shd w:val="clear" w:color="auto" w:fill="EEF2F7"/>
+          </w:tcPr>
+          <w:p>
+            <w:r>
+              <w:rPr>
+                <w:b w:val="0"/>
+                <w:i w:val="0"/>
+                <w:sz w:val="19"/>
+              </w:rPr>
+              <w:t>Node.js ≥ 20 LTS (probado en 22.23)</w:t>
+            </w:r>
+          </w:p>
+        </w:tc>
+      </w:tr>
+      <w:tr>
+        <w:tc>
+          <w:tcPr>
+            <w:tcW w:type="dxa" w:w="4873"/>
+          </w:tcPr>
+          <w:p>
+            <w:r>
+              <w:rPr>
+                <w:b w:val="0"/>
+                <w:i w:val="0"/>
+                <w:sz w:val="19"/>
+              </w:rPr>
+              <w:t>Servidor HTTP</w:t>
+            </w:r>
+          </w:p>
+        </w:tc>
+        <w:tc>
+          <w:tcPr>
+            <w:tcW w:type="dxa" w:w="4873"/>
+          </w:tcPr>
+          <w:p>
+            <w:r>
+              <w:rPr>
+                <w:rFonts w:ascii="Consolas" w:hAnsi="Consolas"/>
+                <w:b w:val="0"/>
+                <w:i w:val="0"/>
+                <w:color w:val="B03060"/>
+                <w:sz w:val="19"/>
+              </w:rPr>
+              <w:t>node:http</w:t>
+            </w:r>
+            <w:r>
+              <w:rPr>
+                <w:b w:val="0"/>
+                <w:i w:val="0"/>
+                <w:sz w:val="19"/>
+              </w:rPr>
+              <w:t xml:space="preserve"> nativo</w:t>
+            </w:r>
+          </w:p>
+        </w:tc>
+      </w:tr>
+      <w:tr>
+        <w:tc>
+          <w:tcPr>
+            <w:tcW w:type="dxa" w:w="4873"/>
+            <w:shd w:val="clear" w:color="auto" w:fill="EEF2F7"/>
+          </w:tcPr>
+          <w:p>
+            <w:r>
+              <w:rPr>
+                <w:b w:val="0"/>
+                <w:i w:val="0"/>
+                <w:sz w:val="19"/>
+              </w:rPr>
+              <w:t>Pruebas</w:t>
+            </w:r>
+          </w:p>
+        </w:tc>
+        <w:tc>
+          <w:tcPr>
+            <w:tcW w:type="dxa" w:w="4873"/>
+            <w:shd w:val="clear" w:color="auto" w:fill="EEF2F7"/>
+          </w:tcPr>
+          <w:p>
+            <w:r>
+              <w:rPr>
+                <w:rFonts w:ascii="Consolas" w:hAnsi="Consolas"/>
+                <w:b w:val="0"/>
+                <w:i w:val="0"/>
+                <w:color w:val="B03060"/>
+                <w:sz w:val="19"/>
+              </w:rPr>
+              <w:t>node:test</w:t>
+            </w:r>
+            <w:r>
+              <w:rPr>
+                <w:b w:val="0"/>
+                <w:i w:val="0"/>
+                <w:sz w:val="19"/>
+              </w:rPr>
+              <w:t xml:space="preserve"> + </w:t>
+            </w:r>
+            <w:r>
+              <w:rPr>
+                <w:rFonts w:ascii="Consolas" w:hAnsi="Consolas"/>
+                <w:b w:val="0"/>
+                <w:i w:val="0"/>
+                <w:color w:val="B03060"/>
+                <w:sz w:val="19"/>
+              </w:rPr>
+              <w:t>node:assert</w:t>
+            </w:r>
+            <w:r>
+              <w:rPr>
+                <w:b w:val="0"/>
+                <w:i w:val="0"/>
+                <w:sz w:val="19"/>
+              </w:rPr>
+              <w:t xml:space="preserve"> + </w:t>
+            </w:r>
+            <w:r>
+              <w:rPr>
+                <w:rFonts w:ascii="Consolas" w:hAnsi="Consolas"/>
+                <w:b w:val="0"/>
+                <w:i w:val="0"/>
+                <w:color w:val="B03060"/>
+                <w:sz w:val="19"/>
+              </w:rPr>
+              <w:t>fetch</w:t>
+            </w:r>
+            <w:r>
+              <w:rPr>
+                <w:b w:val="0"/>
+                <w:i w:val="0"/>
+                <w:sz w:val="19"/>
+              </w:rPr>
+              <w:t xml:space="preserve"> nativo</w:t>
+            </w:r>
+          </w:p>
+        </w:tc>
+      </w:tr>
+      <w:tr>
+        <w:tc>
+          <w:tcPr>
+            <w:tcW w:type="dxa" w:w="4873"/>
+          </w:tcPr>
+          <w:p>
+            <w:r>
+              <w:rPr>
+                <w:b w:val="0"/>
+                <w:i w:val="0"/>
+                <w:sz w:val="19"/>
+              </w:rPr>
+              <w:t>Persistencia (iteración 1)</w:t>
+            </w:r>
+          </w:p>
+        </w:tc>
+        <w:tc>
+          <w:tcPr>
+            <w:tcW w:type="dxa" w:w="4873"/>
+          </w:tcPr>
+          <w:p>
+            <w:r>
+              <w:rPr>
+                <w:b w:val="0"/>
+                <w:i w:val="0"/>
+                <w:sz w:val="19"/>
+              </w:rPr>
+              <w:t>Archivo JSON local con escritura atómica</w:t>
+            </w:r>
+          </w:p>
+        </w:tc>
+      </w:tr>
+      <w:tr>
+        <w:tc>
+          <w:tcPr>
+            <w:tcW w:type="dxa" w:w="4873"/>
+            <w:shd w:val="clear" w:color="auto" w:fill="EEF2F7"/>
+          </w:tcPr>
+          <w:p>
+            <w:r>
+              <w:rPr>
+                <w:b w:val="0"/>
+                <w:i w:val="0"/>
+                <w:sz w:val="19"/>
+              </w:rPr>
+              <w:t>Dependencias de ejecución</w:t>
+            </w:r>
+          </w:p>
+        </w:tc>
+        <w:tc>
+          <w:tcPr>
+            <w:tcW w:type="dxa" w:w="4873"/>
+            <w:shd w:val="clear" w:color="auto" w:fill="EEF2F7"/>
+          </w:tcPr>
+          <w:p>
+            <w:r>
+              <w:rPr>
+                <w:b/>
+                <w:i w:val="0"/>
+                <w:sz w:val="19"/>
+              </w:rPr>
+              <w:t>Ninguna</w:t>
+            </w:r>
+          </w:p>
+        </w:tc>
+      </w:tr>
+    </w:tbl>
+    <w:p/>
+    <w:p>
+      <w:pPr>
+        <w:pStyle w:val="Heading2"/>
+      </w:pPr>
+      <w:r>
+        <w:rPr>
+          <w:b w:val="0"/>
+          <w:i w:val="0"/>
+          <w:color w:val="1F3A5F"/>
+        </w:rPr>
+        <w:t>2. Principios fundamentales</w:t>
       </w:r>
     </w:p>
     <w:p>
@@ -187,7 +600,7 @@
           <w:i w:val="0"/>
           <w:color w:val="1F3A5F"/>
         </w:rPr>
-        <w:t>I. Especificación antes que código (NO NEGOCIABLE)</w:t>
+        <w:t>I. La especificación es la fuente de verdad (NO NEGOCIABLE)</w:t>
       </w:r>
     </w:p>
     <w:p>
@@ -199,7 +612,7 @@
           <w:b w:val="0"/>
           <w:i w:val="0"/>
         </w:rPr>
-        <w:t>No se escribe código de producción sin una especificación (</w:t>
+        <w:t xml:space="preserve">No se escribe código de producción sin </w:t>
       </w:r>
       <w:r>
         <w:rPr>
@@ -215,7 +628,7 @@
           <w:b w:val="0"/>
           <w:i w:val="0"/>
         </w:rPr>
-        <w:t>) aprobada, un plan técnico (</w:t>
+        <w:t xml:space="preserve">, </w:t>
       </w:r>
       <w:r>
         <w:rPr>
@@ -231,7 +644,7 @@
           <w:b w:val="0"/>
           <w:i w:val="0"/>
         </w:rPr>
-        <w:t>) y una lista de tareas (</w:t>
+        <w:t xml:space="preserve"> y </w:t>
       </w:r>
       <w:r>
         <w:rPr>
@@ -247,7 +660,7 @@
           <w:b w:val="0"/>
           <w:i w:val="0"/>
         </w:rPr>
-        <w:t>).</w:t>
+        <w:t xml:space="preserve"> aprobados en sus puertas de revisión.</w:t>
       </w:r>
     </w:p>
     <w:p>
@@ -259,39 +672,7 @@
           <w:b w:val="0"/>
           <w:i w:val="0"/>
         </w:rPr>
-        <w:t>Todo requisito implementado debe trazarse a un identificador de la especificación (</w:t>
-      </w:r>
-      <w:r>
-        <w:rPr>
-          <w:rFonts w:ascii="Consolas" w:hAnsi="Consolas"/>
-          <w:b w:val="0"/>
-          <w:i w:val="0"/>
-          <w:color w:val="B03060"/>
-        </w:rPr>
-        <w:t>US-x</w:t>
-      </w:r>
-      <w:r>
-        <w:rPr>
-          <w:b w:val="0"/>
-          <w:i w:val="0"/>
-        </w:rPr>
-        <w:t xml:space="preserve">, </w:t>
-      </w:r>
-      <w:r>
-        <w:rPr>
-          <w:rFonts w:ascii="Consolas" w:hAnsi="Consolas"/>
-          <w:b w:val="0"/>
-          <w:i w:val="0"/>
-          <w:color w:val="B03060"/>
-        </w:rPr>
-        <w:t>FR-xxx</w:t>
-      </w:r>
-      <w:r>
-        <w:rPr>
-          <w:b w:val="0"/>
-          <w:i w:val="0"/>
-        </w:rPr>
-        <w:t>).</w:t>
+        <w:t>Si el código y la spec no coinciden, uno de los dos está mal y se resuelve de forma explícita, sin ignorar la diferencia.</w:t>
       </w:r>
     </w:p>
     <w:p>
@@ -303,7 +684,21 @@
           <w:b w:val="0"/>
           <w:i w:val="0"/>
         </w:rPr>
-        <w:t>Si surge una ambigüedad durante la implementación, se detiene la tarea, se actualiza la especificación y luego se continúa.</w:t>
+        <w:t xml:space="preserve">Si una tarea es ambigua o contradice la spec, el agente </w:t>
+      </w:r>
+      <w:r>
+        <w:rPr>
+          <w:b/>
+          <w:i w:val="0"/>
+        </w:rPr>
+        <w:t>se detiene y pregunta</w:t>
+      </w:r>
+      <w:r>
+        <w:rPr>
+          <w:b w:val="0"/>
+          <w:i w:val="0"/>
+        </w:rPr>
+        <w:t>.</w:t>
       </w:r>
     </w:p>
     <w:p>
@@ -328,10 +723,8 @@
           <w:b w:val="0"/>
           <w:i w:val="0"/>
         </w:rPr>
-        <w:t>El sistema se organiza en cuatro capas con dependencias en un solo sentido:</w:t>
+        <w:t xml:space="preserve">Dependencias en un solo sentido: </w:t>
       </w:r>
-    </w:p>
-    <w:p>
       <w:r>
         <w:rPr>
           <w:rFonts w:ascii="Consolas" w:hAnsi="Consolas"/>
@@ -374,21 +767,21 @@
           <w:b w:val="0"/>
           <w:i w:val="0"/>
         </w:rPr>
-        <w:t xml:space="preserve">La capa </w:t>
+        <w:t xml:space="preserve">El </w:t>
       </w:r>
       <w:r>
         <w:rPr>
           <w:b/>
           <w:i w:val="0"/>
         </w:rPr>
-        <w:t>domain</w:t>
+        <w:t>dominio</w:t>
       </w:r>
       <w:r>
         <w:rPr>
           <w:b w:val="0"/>
           <w:i w:val="0"/>
         </w:rPr>
-        <w:t xml:space="preserve"> no depende de Node.js HTTP ni del sistema de archivos: contiene reglas de negocio puras.</w:t>
+        <w:t xml:space="preserve"> no depende de la infraestructura (ni HTTP ni sistema de archivos).</w:t>
       </w:r>
     </w:p>
     <w:p>
@@ -400,19 +793,21 @@
           <w:b w:val="0"/>
           <w:i w:val="0"/>
         </w:rPr>
-        <w:t>Cada módulo tiene una única responsabilidad (SRP). Las funciones no superan ~40 líneas.</w:t>
+        <w:t xml:space="preserve">Los errores de dominio son </w:t>
       </w:r>
-    </w:p>
-    <w:p>
-      <w:pPr>
-        <w:pStyle w:val="ListBullet"/>
-      </w:pPr>
+      <w:r>
+        <w:rPr>
+          <w:b/>
+          <w:i w:val="0"/>
+        </w:rPr>
+        <w:t>tipos</w:t>
+      </w:r>
       <w:r>
         <w:rPr>
           <w:b w:val="0"/>
           <w:i w:val="0"/>
         </w:rPr>
-        <w:t>Los nombres de dominio se escriben en el idioma del negocio (español) cuando representan valores visibles para el usuario (</w:t>
+        <w:t xml:space="preserve"> (</w:t>
       </w:r>
       <w:r>
         <w:rPr>
@@ -421,7 +816,7 @@
           <w:i w:val="0"/>
           <w:color w:val="B03060"/>
         </w:rPr>
-        <w:t>pendiente</w:t>
+        <w:t>ValidationError</w:t>
       </w:r>
       <w:r>
         <w:rPr>
@@ -437,14 +832,14 @@
           <w:i w:val="0"/>
           <w:color w:val="B03060"/>
         </w:rPr>
-        <w:t>alta</w:t>
+        <w:t>NotFoundError</w:t>
       </w:r>
       <w:r>
         <w:rPr>
           <w:b w:val="0"/>
           <w:i w:val="0"/>
         </w:rPr>
-        <w:t xml:space="preserve">); los identificadores de código siguen la convención inglesa </w:t>
+        <w:t xml:space="preserve">, </w:t>
       </w:r>
       <w:r>
         <w:rPr>
@@ -453,7 +848,181 @@
           <w:i w:val="0"/>
           <w:color w:val="B03060"/>
         </w:rPr>
-        <w:t>camelCase</w:t>
+        <w:t>TransitionError</w:t>
+      </w:r>
+      <w:r>
+        <w:rPr>
+          <w:b w:val="0"/>
+          <w:i w:val="0"/>
+        </w:rPr>
+        <w:t>), no strings.</w:t>
+      </w:r>
+    </w:p>
+    <w:p>
+      <w:pPr>
+        <w:pStyle w:val="ListBullet"/>
+      </w:pPr>
+      <w:r>
+        <w:rPr>
+          <w:b w:val="0"/>
+          <w:i w:val="0"/>
+        </w:rPr>
+        <w:t>Cada módulo tiene una sola responsabilidad. El repositorio devuelve copias, nunca referencias internas.</w:t>
+      </w:r>
+    </w:p>
+    <w:p>
+      <w:pPr>
+        <w:pStyle w:val="Heading3"/>
+      </w:pPr>
+      <w:r>
+        <w:rPr>
+          <w:b w:val="0"/>
+          <w:i w:val="0"/>
+          <w:color w:val="1F3A5F"/>
+        </w:rPr>
+        <w:t>III. Requisitos verificables y pruebas trazables (NO NEGOCIABLE)</w:t>
+      </w:r>
+    </w:p>
+    <w:p>
+      <w:pPr>
+        <w:pStyle w:val="ListBullet"/>
+      </w:pPr>
+      <w:r>
+        <w:rPr>
+          <w:b w:val="0"/>
+          <w:i w:val="0"/>
+        </w:rPr>
+        <w:t>Cada requisito tiene un ID (</w:t>
+      </w:r>
+      <w:r>
+        <w:rPr>
+          <w:rFonts w:ascii="Consolas" w:hAnsi="Consolas"/>
+          <w:b w:val="0"/>
+          <w:i w:val="0"/>
+          <w:color w:val="B03060"/>
+        </w:rPr>
+        <w:t>FR-xxx</w:t>
+      </w:r>
+      <w:r>
+        <w:rPr>
+          <w:b w:val="0"/>
+          <w:i w:val="0"/>
+        </w:rPr>
+        <w:t xml:space="preserve">, </w:t>
+      </w:r>
+      <w:r>
+        <w:rPr>
+          <w:rFonts w:ascii="Consolas" w:hAnsi="Consolas"/>
+          <w:b w:val="0"/>
+          <w:i w:val="0"/>
+          <w:color w:val="B03060"/>
+        </w:rPr>
+        <w:t>NFR-xxx</w:t>
+      </w:r>
+      <w:r>
+        <w:rPr>
+          <w:b w:val="0"/>
+          <w:i w:val="0"/>
+        </w:rPr>
+        <w:t>) y al menos una prueba automatizada.</w:t>
+      </w:r>
+    </w:p>
+    <w:p>
+      <w:pPr>
+        <w:pStyle w:val="ListBullet"/>
+      </w:pPr>
+      <w:r>
+        <w:rPr>
+          <w:b/>
+          <w:i w:val="0"/>
+        </w:rPr>
+        <w:t>El nombre de cada prueba lleva el ID del requisito</w:t>
+      </w:r>
+      <w:r>
+        <w:rPr>
+          <w:b w:val="0"/>
+          <w:i w:val="0"/>
+        </w:rPr>
+        <w:t xml:space="preserve"> que verifica, por ejemplo </w:t>
+      </w:r>
+      <w:r>
+        <w:rPr>
+          <w:rFonts w:ascii="Consolas" w:hAnsi="Consolas"/>
+          <w:b w:val="0"/>
+          <w:i w:val="0"/>
+          <w:color w:val="B03060"/>
+        </w:rPr>
+        <w:t>[FR-007] 409 ante transición…</w:t>
+      </w:r>
+      <w:r>
+        <w:rPr>
+          <w:b w:val="0"/>
+          <w:i w:val="0"/>
+        </w:rPr>
+        <w:t>.</w:t>
+      </w:r>
+    </w:p>
+    <w:p>
+      <w:pPr>
+        <w:pStyle w:val="ListBullet"/>
+      </w:pPr>
+      <w:r>
+        <w:rPr>
+          <w:b w:val="0"/>
+          <w:i w:val="0"/>
+        </w:rPr>
+        <w:t>Ciclo Rojo → Verde → Refactor.</w:t>
+      </w:r>
+    </w:p>
+    <w:p>
+      <w:pPr>
+        <w:pStyle w:val="ListBullet"/>
+      </w:pPr>
+      <w:r>
+        <w:rPr>
+          <w:b w:val="0"/>
+          <w:i w:val="0"/>
+        </w:rPr>
+        <w:t xml:space="preserve">Cobertura mínima sobre </w:t>
+      </w:r>
+      <w:r>
+        <w:rPr>
+          <w:rFonts w:ascii="Consolas" w:hAnsi="Consolas"/>
+          <w:b w:val="0"/>
+          <w:i w:val="0"/>
+          <w:color w:val="B03060"/>
+        </w:rPr>
+        <w:t>src/</w:t>
+      </w:r>
+      <w:r>
+        <w:rPr>
+          <w:b w:val="0"/>
+          <w:i w:val="0"/>
+        </w:rPr>
+        <w:t xml:space="preserve"> (sin contar </w:t>
+      </w:r>
+      <w:r>
+        <w:rPr>
+          <w:rFonts w:ascii="Consolas" w:hAnsi="Consolas"/>
+          <w:b w:val="0"/>
+          <w:i w:val="0"/>
+          <w:color w:val="B03060"/>
+        </w:rPr>
+        <w:t>server.js</w:t>
+      </w:r>
+      <w:r>
+        <w:rPr>
+          <w:b w:val="0"/>
+          <w:i w:val="0"/>
+        </w:rPr>
+        <w:t xml:space="preserve">): </w:t>
+      </w:r>
+      <w:r>
+        <w:rPr>
+          <w:b/>
+          <w:i w:val="0"/>
+        </w:rPr>
+        <w:t>líneas ≥ 90 %, ramas ≥ 85 %, funciones ≥ 90 %</w:t>
       </w:r>
       <w:r>
         <w:rPr>
@@ -473,7 +1042,7 @@
           <w:i w:val="0"/>
           <w:color w:val="1F3A5F"/>
         </w:rPr>
-        <w:t>III. Pruebas primero y cobertura mínima (NO NEGOCIABLE)</w:t>
+        <w:t>IV. Incrementos pequeños</w:t>
       </w:r>
     </w:p>
     <w:p>
@@ -485,49 +1054,21 @@
           <w:b w:val="0"/>
           <w:i w:val="0"/>
         </w:rPr>
-        <w:t xml:space="preserve">Cada historia de usuario tiene pruebas automatizadas de </w:t>
+        <w:t xml:space="preserve">Se implementa </w:t>
       </w:r>
       <w:r>
         <w:rPr>
           <w:b/>
           <w:i w:val="0"/>
         </w:rPr>
-        <w:t>dominio</w:t>
+        <w:t>una tarea a la vez</w:t>
       </w:r>
       <w:r>
         <w:rPr>
           <w:b w:val="0"/>
           <w:i w:val="0"/>
         </w:rPr>
-        <w:t xml:space="preserve">, </w:t>
-      </w:r>
-      <w:r>
-        <w:rPr>
-          <w:b/>
-          <w:i w:val="0"/>
-        </w:rPr>
-        <w:t>servicio</w:t>
-      </w:r>
-      <w:r>
-        <w:rPr>
-          <w:b w:val="0"/>
-          <w:i w:val="0"/>
-        </w:rPr>
-        <w:t xml:space="preserve"> y </w:t>
-      </w:r>
-      <w:r>
-        <w:rPr>
-          <w:b/>
-          <w:i w:val="0"/>
-        </w:rPr>
-        <w:t>API (integración)</w:t>
-      </w:r>
-      <w:r>
-        <w:rPr>
-          <w:b w:val="0"/>
-          <w:i w:val="0"/>
-        </w:rPr>
-        <w:t>.</w:t>
+        <w:t>. Cada tarea debe poder revisarse en minutos.</w:t>
       </w:r>
     </w:p>
     <w:p>
@@ -539,256 +1080,21 @@
           <w:b w:val="0"/>
           <w:i w:val="0"/>
         </w:rPr>
-        <w:t>Se sigue el ciclo Rojo → Verde → Refactor: la prueba se escribe antes o junto con el código que verifica.</w:t>
-      </w:r>
-    </w:p>
-    <w:p>
-      <w:pPr>
-        <w:pStyle w:val="ListBullet"/>
-      </w:pPr>
-      <w:r>
-        <w:rPr>
-          <w:b w:val="0"/>
-          <w:i w:val="0"/>
-        </w:rPr>
-        <w:t xml:space="preserve">Umbral mínimo de cobertura sobre </w:t>
+        <w:t>Cada tarea tiene su criterio "</w:t>
       </w:r>
       <w:r>
         <w:rPr>
-          <w:rFonts w:ascii="Consolas" w:hAnsi="Consolas"/>
-          <w:b w:val="0"/>
+          <w:b/>
           <w:i w:val="0"/>
-          <w:color w:val="B03060"/>
         </w:rPr>
-        <w:t>src/</w:t>
+        <w:t>Hecho cuando…</w:t>
       </w:r>
       <w:r>
         <w:rPr>
           <w:b w:val="0"/>
           <w:i w:val="0"/>
         </w:rPr>
-        <w:t xml:space="preserve"> (sin contar el arranque </w:t>
-      </w:r>
-      <w:r>
-        <w:rPr>
-          <w:rFonts w:ascii="Consolas" w:hAnsi="Consolas"/>
-          <w:b w:val="0"/>
-          <w:i w:val="0"/>
-          <w:color w:val="B03060"/>
-        </w:rPr>
-        <w:t>server.js</w:t>
-      </w:r>
-      <w:r>
-        <w:rPr>
-          <w:b w:val="0"/>
-          <w:i w:val="0"/>
-        </w:rPr>
-        <w:t>):</w:t>
-      </w:r>
-    </w:p>
-    <w:p>
-      <w:pPr>
-        <w:pStyle w:val="ListBullet2"/>
-      </w:pPr>
-      <w:r>
-        <w:rPr>
-          <w:b/>
-          <w:i w:val="0"/>
-        </w:rPr>
-        <w:t>Líneas ≥ 90 %</w:t>
-      </w:r>
-    </w:p>
-    <w:p>
-      <w:pPr>
-        <w:pStyle w:val="ListBullet2"/>
-      </w:pPr>
-      <w:r>
-        <w:rPr>
-          <w:b/>
-          <w:i w:val="0"/>
-        </w:rPr>
-        <w:t>Ramas ≥ 85 %</w:t>
-      </w:r>
-    </w:p>
-    <w:p>
-      <w:pPr>
-        <w:pStyle w:val="ListBullet2"/>
-      </w:pPr>
-      <w:r>
-        <w:rPr>
-          <w:b/>
-          <w:i w:val="0"/>
-        </w:rPr>
-        <w:t>Funciones ≥ 90 %</w:t>
-      </w:r>
-    </w:p>
-    <w:p>
-      <w:pPr>
-        <w:pStyle w:val="ListBullet"/>
-      </w:pPr>
-      <w:r>
-        <w:rPr>
-          <w:b w:val="0"/>
-          <w:i w:val="0"/>
-        </w:rPr>
-        <w:t xml:space="preserve">Una iteración no puede declararse </w:t>
-      </w:r>
-      <w:r>
-        <w:rPr>
-          <w:b w:val="0"/>
-          <w:i/>
-        </w:rPr>
-        <w:t>Converged</w:t>
-      </w:r>
-      <w:r>
-        <w:rPr>
-          <w:b w:val="0"/>
-          <w:i w:val="0"/>
-        </w:rPr>
-        <w:t xml:space="preserve"> si alguna prueba falla o si la cobertura baja de estos umbrales.</w:t>
-      </w:r>
-    </w:p>
-    <w:p>
-      <w:pPr>
-        <w:pStyle w:val="Heading3"/>
-      </w:pPr>
-      <w:r>
-        <w:rPr>
-          <w:b w:val="0"/>
-          <w:i w:val="0"/>
-          <w:color w:val="1F3A5F"/>
-        </w:rPr>
-        <w:t>IV. Simplicidad y mínimas dependencias</w:t>
-      </w:r>
-    </w:p>
-    <w:p>
-      <w:pPr>
-        <w:pStyle w:val="ListBullet"/>
-      </w:pPr>
-      <w:r>
-        <w:rPr>
-          <w:b w:val="0"/>
-          <w:i w:val="0"/>
-        </w:rPr>
-        <w:t xml:space="preserve">Se usa únicamente la biblioteca estándar de Node.js (≥ 20 LTS): </w:t>
-      </w:r>
-      <w:r>
-        <w:rPr>
-          <w:rFonts w:ascii="Consolas" w:hAnsi="Consolas"/>
-          <w:b w:val="0"/>
-          <w:i w:val="0"/>
-          <w:color w:val="B03060"/>
-        </w:rPr>
-        <w:t>node:http</w:t>
-      </w:r>
-      <w:r>
-        <w:rPr>
-          <w:b w:val="0"/>
-          <w:i w:val="0"/>
-        </w:rPr>
-        <w:t xml:space="preserve">, </w:t>
-      </w:r>
-      <w:r>
-        <w:rPr>
-          <w:rFonts w:ascii="Consolas" w:hAnsi="Consolas"/>
-          <w:b w:val="0"/>
-          <w:i w:val="0"/>
-          <w:color w:val="B03060"/>
-        </w:rPr>
-        <w:t>node:test</w:t>
-      </w:r>
-      <w:r>
-        <w:rPr>
-          <w:b w:val="0"/>
-          <w:i w:val="0"/>
-        </w:rPr>
-        <w:t xml:space="preserve">, </w:t>
-      </w:r>
-      <w:r>
-        <w:rPr>
-          <w:rFonts w:ascii="Consolas" w:hAnsi="Consolas"/>
-          <w:b w:val="0"/>
-          <w:i w:val="0"/>
-          <w:color w:val="B03060"/>
-        </w:rPr>
-        <w:t>node:fs</w:t>
-      </w:r>
-      <w:r>
-        <w:rPr>
-          <w:b w:val="0"/>
-          <w:i w:val="0"/>
-        </w:rPr>
-        <w:t xml:space="preserve">, </w:t>
-      </w:r>
-      <w:r>
-        <w:rPr>
-          <w:rFonts w:ascii="Consolas" w:hAnsi="Consolas"/>
-          <w:b w:val="0"/>
-          <w:i w:val="0"/>
-          <w:color w:val="B03060"/>
-        </w:rPr>
-        <w:t>node:crypto</w:t>
-      </w:r>
-      <w:r>
-        <w:rPr>
-          <w:b w:val="0"/>
-          <w:i w:val="0"/>
-        </w:rPr>
-        <w:t>.</w:t>
-      </w:r>
-    </w:p>
-    <w:p>
-      <w:pPr>
-        <w:pStyle w:val="ListBullet"/>
-      </w:pPr>
-      <w:r>
-        <w:rPr>
-          <w:b w:val="0"/>
-          <w:i w:val="0"/>
-        </w:rPr>
-        <w:t xml:space="preserve">Agregar una dependencia externa requiere justificarla en </w:t>
-      </w:r>
-      <w:r>
-        <w:rPr>
-          <w:rFonts w:ascii="Consolas" w:hAnsi="Consolas"/>
-          <w:b w:val="0"/>
-          <w:i w:val="0"/>
-          <w:color w:val="B03060"/>
-        </w:rPr>
-        <w:t>plan.md</w:t>
-      </w:r>
-      <w:r>
-        <w:rPr>
-          <w:b w:val="0"/>
-          <w:i w:val="0"/>
-        </w:rPr>
-        <w:t xml:space="preserve"> (sección </w:t>
-      </w:r>
-      <w:r>
-        <w:rPr>
-          <w:b w:val="0"/>
-          <w:i/>
-        </w:rPr>
-        <w:t>Complexity Tracking</w:t>
-      </w:r>
-      <w:r>
-        <w:rPr>
-          <w:b w:val="0"/>
-          <w:i w:val="0"/>
-        </w:rPr>
-        <w:t>).</w:t>
-      </w:r>
-    </w:p>
-    <w:p>
-      <w:pPr>
-        <w:pStyle w:val="ListBullet"/>
-      </w:pPr>
-      <w:r>
-        <w:rPr>
-          <w:b w:val="0"/>
-          <w:i w:val="0"/>
-        </w:rPr>
-        <w:t>YAGNI: no se implementa funcionalidad que no esté en la especificación de la iteración en curso.</w:t>
+        <w:t>".</w:t>
       </w:r>
     </w:p>
     <w:p>
@@ -810,55 +1116,10 @@
       </w:pPr>
       <w:r>
         <w:rPr>
-          <w:b/>
-          <w:i w:val="0"/>
-        </w:rPr>
-        <w:t>Validación estricta de entradas</w:t>
-      </w:r>
-      <w:r>
-        <w:rPr>
           <w:b w:val="0"/>
           <w:i w:val="0"/>
         </w:rPr>
-        <w:t xml:space="preserve"> en el borde (HTTP) y en el dominio: tipos, longitudes y valores enumerados.</w:t>
-      </w:r>
-    </w:p>
-    <w:p>
-      <w:pPr>
-        <w:pStyle w:val="ListBullet"/>
-      </w:pPr>
-      <w:r>
-        <w:rPr>
-          <w:b/>
-          <w:i w:val="0"/>
-        </w:rPr>
-        <w:t>Límite de tamaño del cuerpo</w:t>
-      </w:r>
-      <w:r>
-        <w:rPr>
-          <w:b w:val="0"/>
-          <w:i w:val="0"/>
-        </w:rPr>
-        <w:t xml:space="preserve"> de petición (10 KB) para mitigar abuso de recursos.</w:t>
-      </w:r>
-    </w:p>
-    <w:p>
-      <w:pPr>
-        <w:pStyle w:val="ListBullet"/>
-      </w:pPr>
-      <w:r>
-        <w:rPr>
-          <w:b/>
-          <w:i w:val="0"/>
-        </w:rPr>
-        <w:t>No se exponen detalles internos</w:t>
-      </w:r>
-      <w:r>
-        <w:rPr>
-          <w:b w:val="0"/>
-          <w:i w:val="0"/>
-        </w:rPr>
-        <w:t xml:space="preserve"> (trazas, mensajes de excepción) en respuestas 5xx.</w:t>
+        <w:t>Validación estricta de entradas (tipos, longitudes y enumerados).</w:t>
       </w:r>
     </w:p>
     <w:p>
@@ -870,7 +1131,45 @@
           <w:b w:val="0"/>
           <w:i w:val="0"/>
         </w:rPr>
-        <w:t>Cabeceras seguras mínimas (</w:t>
+        <w:t>Límite de 10 KB para el cuerpo de las peticiones.</w:t>
+      </w:r>
+    </w:p>
+    <w:p>
+      <w:pPr>
+        <w:pStyle w:val="ListBullet"/>
+      </w:pPr>
+      <w:r>
+        <w:rPr>
+          <w:b w:val="0"/>
+          <w:i w:val="0"/>
+        </w:rPr>
+        <w:t xml:space="preserve">Las respuestas 5xx </w:t>
+      </w:r>
+      <w:r>
+        <w:rPr>
+          <w:b/>
+          <w:i w:val="0"/>
+        </w:rPr>
+        <w:t>no exponen</w:t>
+      </w:r>
+      <w:r>
+        <w:rPr>
+          <w:b w:val="0"/>
+          <w:i w:val="0"/>
+        </w:rPr>
+        <w:t xml:space="preserve"> detalles internos.</w:t>
+      </w:r>
+    </w:p>
+    <w:p>
+      <w:pPr>
+        <w:pStyle w:val="ListBullet"/>
+      </w:pPr>
+      <w:r>
+        <w:rPr>
+          <w:b w:val="0"/>
+          <w:i w:val="0"/>
+        </w:rPr>
+        <w:t xml:space="preserve">Cabeceras </w:t>
       </w:r>
       <w:r>
         <w:rPr>
@@ -886,7 +1185,7 @@
           <w:b w:val="0"/>
           <w:i w:val="0"/>
         </w:rPr>
-        <w:t xml:space="preserve"> explícito y </w:t>
+        <w:t xml:space="preserve"> explícita y </w:t>
       </w:r>
       <w:r>
         <w:rPr>
@@ -902,7 +1201,7 @@
           <w:b w:val="0"/>
           <w:i w:val="0"/>
         </w:rPr>
-        <w:t>).</w:t>
+        <w:t>.</w:t>
       </w:r>
     </w:p>
     <w:p>
@@ -914,7 +1213,7 @@
           <w:b w:val="0"/>
           <w:i w:val="0"/>
         </w:rPr>
-        <w:t>No se guardan secretos en el repositorio; la configuración se hace por variables de entorno (</w:t>
+        <w:t>Ningún secreto en el código. La configuración va en variables de entorno (</w:t>
       </w:r>
       <w:r>
         <w:rPr>
@@ -971,151 +1270,7 @@
           <w:b w:val="0"/>
           <w:i w:val="0"/>
         </w:rPr>
-        <w:t xml:space="preserve">La API responde siempre JSON con códigos HTTP semánticos: </w:t>
-      </w:r>
-      <w:r>
-        <w:rPr>
-          <w:rFonts w:ascii="Consolas" w:hAnsi="Consolas"/>
-          <w:b w:val="0"/>
-          <w:i w:val="0"/>
-          <w:color w:val="B03060"/>
-        </w:rPr>
-        <w:t>200</w:t>
-      </w:r>
-      <w:r>
-        <w:rPr>
-          <w:b w:val="0"/>
-          <w:i w:val="0"/>
-        </w:rPr>
-        <w:t xml:space="preserve">, </w:t>
-      </w:r>
-      <w:r>
-        <w:rPr>
-          <w:rFonts w:ascii="Consolas" w:hAnsi="Consolas"/>
-          <w:b w:val="0"/>
-          <w:i w:val="0"/>
-          <w:color w:val="B03060"/>
-        </w:rPr>
-        <w:t>201</w:t>
-      </w:r>
-      <w:r>
-        <w:rPr>
-          <w:b w:val="0"/>
-          <w:i w:val="0"/>
-        </w:rPr>
-        <w:t xml:space="preserve">, </w:t>
-      </w:r>
-      <w:r>
-        <w:rPr>
-          <w:rFonts w:ascii="Consolas" w:hAnsi="Consolas"/>
-          <w:b w:val="0"/>
-          <w:i w:val="0"/>
-          <w:color w:val="B03060"/>
-        </w:rPr>
-        <w:t>204</w:t>
-      </w:r>
-      <w:r>
-        <w:rPr>
-          <w:b w:val="0"/>
-          <w:i w:val="0"/>
-        </w:rPr>
-        <w:t xml:space="preserve">, </w:t>
-      </w:r>
-      <w:r>
-        <w:rPr>
-          <w:rFonts w:ascii="Consolas" w:hAnsi="Consolas"/>
-          <w:b w:val="0"/>
-          <w:i w:val="0"/>
-          <w:color w:val="B03060"/>
-        </w:rPr>
-        <w:t>400</w:t>
-      </w:r>
-      <w:r>
-        <w:rPr>
-          <w:b w:val="0"/>
-          <w:i w:val="0"/>
-        </w:rPr>
-        <w:t xml:space="preserve">, </w:t>
-      </w:r>
-      <w:r>
-        <w:rPr>
-          <w:rFonts w:ascii="Consolas" w:hAnsi="Consolas"/>
-          <w:b w:val="0"/>
-          <w:i w:val="0"/>
-          <w:color w:val="B03060"/>
-        </w:rPr>
-        <w:t>404</w:t>
-      </w:r>
-      <w:r>
-        <w:rPr>
-          <w:b w:val="0"/>
-          <w:i w:val="0"/>
-        </w:rPr>
-        <w:t xml:space="preserve">, </w:t>
-      </w:r>
-      <w:r>
-        <w:rPr>
-          <w:rFonts w:ascii="Consolas" w:hAnsi="Consolas"/>
-          <w:b w:val="0"/>
-          <w:i w:val="0"/>
-          <w:color w:val="B03060"/>
-        </w:rPr>
-        <w:t>405</w:t>
-      </w:r>
-      <w:r>
-        <w:rPr>
-          <w:b w:val="0"/>
-          <w:i w:val="0"/>
-        </w:rPr>
-        <w:t xml:space="preserve">, </w:t>
-      </w:r>
-      <w:r>
-        <w:rPr>
-          <w:rFonts w:ascii="Consolas" w:hAnsi="Consolas"/>
-          <w:b w:val="0"/>
-          <w:i w:val="0"/>
-          <w:color w:val="B03060"/>
-        </w:rPr>
-        <w:t>409</w:t>
-      </w:r>
-      <w:r>
-        <w:rPr>
-          <w:b w:val="0"/>
-          <w:i w:val="0"/>
-        </w:rPr>
-        <w:t xml:space="preserve">, </w:t>
-      </w:r>
-      <w:r>
-        <w:rPr>
-          <w:rFonts w:ascii="Consolas" w:hAnsi="Consolas"/>
-          <w:b w:val="0"/>
-          <w:i w:val="0"/>
-          <w:color w:val="B03060"/>
-        </w:rPr>
-        <w:t>413</w:t>
-      </w:r>
-      <w:r>
-        <w:rPr>
-          <w:b w:val="0"/>
-          <w:i w:val="0"/>
-        </w:rPr>
-        <w:t xml:space="preserve">, </w:t>
-      </w:r>
-      <w:r>
-        <w:rPr>
-          <w:rFonts w:ascii="Consolas" w:hAnsi="Consolas"/>
-          <w:b w:val="0"/>
-          <w:i w:val="0"/>
-          <w:color w:val="B03060"/>
-        </w:rPr>
-        <w:t>500</w:t>
-      </w:r>
-      <w:r>
-        <w:rPr>
-          <w:b w:val="0"/>
-          <w:i w:val="0"/>
-        </w:rPr>
-        <w:t>.</w:t>
+        <w:t>Siempre se responde JSON, con códigos HTTP semánticos (200, 201, 204, 400, 404, 405, 409, 413, 500).</w:t>
       </w:r>
     </w:p>
     <w:p>
@@ -1148,6 +1303,19 @@
     </w:p>
     <w:p>
       <w:pPr>
+        <w:pStyle w:val="Heading3"/>
+      </w:pPr>
+      <w:r>
+        <w:rPr>
+          <w:b w:val="0"/>
+          <w:i w:val="0"/>
+          <w:color w:val="1F3A5F"/>
+        </w:rPr>
+        <w:t>VII. Todo versionado y especificación viva</w:t>
+      </w:r>
+    </w:p>
+    <w:p>
+      <w:pPr>
         <w:pStyle w:val="ListBullet"/>
       </w:pPr>
       <w:r>
@@ -1155,7 +1323,72 @@
           <w:b w:val="0"/>
           <w:i w:val="0"/>
         </w:rPr>
-        <w:t xml:space="preserve">Los cambios de contrato se documentan en </w:t>
+        <w:t xml:space="preserve">Las specs viven en el repositorio junto al código y se revisan </w:t>
+      </w:r>
+      <w:r>
+        <w:rPr>
+          <w:b/>
+          <w:i w:val="0"/>
+        </w:rPr>
+        <w:t>en el mismo commit o PR</w:t>
+      </w:r>
+      <w:r>
+        <w:rPr>
+          <w:b w:val="0"/>
+          <w:i w:val="0"/>
+        </w:rPr>
+        <w:t xml:space="preserve"> que el código.</w:t>
+      </w:r>
+    </w:p>
+    <w:p>
+      <w:pPr>
+        <w:pStyle w:val="ListBullet"/>
+      </w:pPr>
+      <w:r>
+        <w:rPr>
+          <w:b w:val="0"/>
+          <w:i w:val="0"/>
+        </w:rPr>
+        <w:t xml:space="preserve">Si durante la implementación se descubre algo nuevo, </w:t>
+      </w:r>
+      <w:r>
+        <w:rPr>
+          <w:b/>
+          <w:i w:val="0"/>
+        </w:rPr>
+        <w:t>se actualiza la spec</w:t>
+      </w:r>
+      <w:r>
+        <w:rPr>
+          <w:b w:val="0"/>
+          <w:i w:val="0"/>
+        </w:rPr>
+        <w:t>, no solo el código.</w:t>
+      </w:r>
+    </w:p>
+    <w:p>
+      <w:pPr>
+        <w:pStyle w:val="Heading2"/>
+      </w:pPr>
+      <w:r>
+        <w:rPr>
+          <w:b w:val="0"/>
+          <w:i w:val="0"/>
+          <w:color w:val="1F3A5F"/>
+        </w:rPr>
+        <w:t>3. Prohibido</w:t>
+      </w:r>
+    </w:p>
+    <w:p>
+      <w:pPr>
+        <w:pStyle w:val="ListBullet"/>
+      </w:pPr>
+      <w:r>
+        <w:rPr>
+          <w:b w:val="0"/>
+          <w:i w:val="0"/>
+        </w:rPr>
+        <w:t xml:space="preserve">❌ Agregar dependencias sin justificarlas en </w:t>
       </w:r>
       <w:r>
         <w:rPr>
@@ -1171,20 +1404,21 @@
           <w:b w:val="0"/>
           <w:i w:val="0"/>
         </w:rPr>
-        <w:t xml:space="preserve"> antes de implementarse.</w:t>
+        <w:t xml:space="preserve"> (sección </w:t>
       </w:r>
-    </w:p>
-    <w:p>
-      <w:pPr>
-        <w:pStyle w:val="Heading3"/>
-      </w:pPr>
+      <w:r>
+        <w:rPr>
+          <w:b w:val="0"/>
+          <w:i/>
+        </w:rPr>
+        <w:t>Complexity Tracking</w:t>
+      </w:r>
       <w:r>
         <w:rPr>
           <w:b w:val="0"/>
           <w:i w:val="0"/>
-          <w:color w:val="1F3A5F"/>
         </w:rPr>
-        <w:t>VII. Documentación viva y trazabilidad</w:t>
+        <w:t>).</w:t>
       </w:r>
     </w:p>
     <w:p>
@@ -1196,55 +1430,7 @@
           <w:b w:val="0"/>
           <w:i w:val="0"/>
         </w:rPr>
-        <w:t xml:space="preserve">Los artefactos </w:t>
-      </w:r>
-      <w:r>
-        <w:rPr>
-          <w:rFonts w:ascii="Consolas" w:hAnsi="Consolas"/>
-          <w:b w:val="0"/>
-          <w:i w:val="0"/>
-          <w:color w:val="B03060"/>
-        </w:rPr>
-        <w:t>constitution.md</w:t>
-      </w:r>
-      <w:r>
-        <w:rPr>
-          <w:b w:val="0"/>
-          <w:i w:val="0"/>
-        </w:rPr>
-        <w:t xml:space="preserve">, </w:t>
-      </w:r>
-      <w:r>
-        <w:rPr>
-          <w:rFonts w:ascii="Consolas" w:hAnsi="Consolas"/>
-          <w:b w:val="0"/>
-          <w:i w:val="0"/>
-          <w:color w:val="B03060"/>
-        </w:rPr>
-        <w:t>spec.md</w:t>
-      </w:r>
-      <w:r>
-        <w:rPr>
-          <w:b w:val="0"/>
-          <w:i w:val="0"/>
-        </w:rPr>
-        <w:t xml:space="preserve">, </w:t>
-      </w:r>
-      <w:r>
-        <w:rPr>
-          <w:rFonts w:ascii="Consolas" w:hAnsi="Consolas"/>
-          <w:b w:val="0"/>
-          <w:i w:val="0"/>
-          <w:color w:val="B03060"/>
-        </w:rPr>
-        <w:t>plan.md</w:t>
-      </w:r>
-      <w:r>
-        <w:rPr>
-          <w:b w:val="0"/>
-          <w:i w:val="0"/>
-        </w:rPr>
-        <w:t xml:space="preserve">, </w:t>
+        <w:t xml:space="preserve">❌ Escribir código que no se pueda trazar a una tarea de </w:t>
       </w:r>
       <w:r>
         <w:rPr>
@@ -1260,7 +1446,7 @@
           <w:b w:val="0"/>
           <w:i w:val="0"/>
         </w:rPr>
-        <w:t>, el reporte de implementación y el reporte de auditoría se versionan junto con el código.</w:t>
+        <w:t>.</w:t>
       </w:r>
     </w:p>
     <w:p>
@@ -1272,39 +1458,85 @@
           <w:b w:val="0"/>
           <w:i w:val="0"/>
         </w:rPr>
-        <w:t xml:space="preserve">Toda tarea completada se marca </w:t>
+        <w:t>❌ Hacer cambios grandes de golpe: un commit equivale a una tarea o a un grupo pequeño de tareas.</w:t>
+      </w:r>
+    </w:p>
+    <w:p>
+      <w:pPr>
+        <w:pStyle w:val="ListBullet"/>
+      </w:pPr>
+      <w:r>
+        <w:rPr>
+          <w:b w:val="0"/>
+          <w:i w:val="0"/>
+        </w:rPr>
+        <w:t xml:space="preserve">❌ Aprobar una fase </w:t>
       </w:r>
       <w:r>
         <w:rPr>
-          <w:rFonts w:ascii="Consolas" w:hAnsi="Consolas"/>
-          <w:b w:val="0"/>
+          <w:b/>
           <w:i w:val="0"/>
-          <w:color w:val="B03060"/>
         </w:rPr>
-        <w:t>[X]</w:t>
+        <w:t>sin leerla</w:t>
       </w:r>
       <w:r>
         <w:rPr>
           <w:b w:val="0"/>
           <w:i w:val="0"/>
         </w:rPr>
-        <w:t xml:space="preserve"> en </w:t>
+        <w:t xml:space="preserve">, porque eso es </w:t>
       </w:r>
       <w:r>
         <w:rPr>
-          <w:rFonts w:ascii="Consolas" w:hAnsi="Consolas"/>
           <w:b w:val="0"/>
-          <w:i w:val="0"/>
-          <w:color w:val="B03060"/>
+          <w:i/>
         </w:rPr>
-        <w:t>tasks.md</w:t>
+        <w:t>vibe coding</w:t>
       </w:r>
       <w:r>
         <w:rPr>
           <w:b w:val="0"/>
           <w:i w:val="0"/>
         </w:rPr>
-        <w:t xml:space="preserve"> con la evidencia (archivo o prueba).</w:t>
+        <w:t xml:space="preserve"> con más pasos.</w:t>
+      </w:r>
+    </w:p>
+    <w:p>
+      <w:pPr>
+        <w:pStyle w:val="ListBullet"/>
+      </w:pPr>
+      <w:r>
+        <w:rPr>
+          <w:b w:val="0"/>
+          <w:i w:val="0"/>
+        </w:rPr>
+        <w:t>❌ Especificar todo el producto de una vez (</w:t>
+      </w:r>
+      <w:r>
+        <w:rPr>
+          <w:b w:val="0"/>
+          <w:i/>
+        </w:rPr>
+        <w:t>waterfall</w:t>
+      </w:r>
+      <w:r>
+        <w:rPr>
+          <w:b w:val="0"/>
+          <w:i w:val="0"/>
+        </w:rPr>
+        <w:t xml:space="preserve"> encubierto). Se especifica por funcionalidad.</w:t>
+      </w:r>
+    </w:p>
+    <w:p>
+      <w:pPr>
+        <w:pStyle w:val="ListBullet"/>
+      </w:pPr>
+      <w:r>
+        <w:rPr>
+          <w:b w:val="0"/>
+          <w:i w:val="0"/>
+        </w:rPr>
+        <w:t>❌ Exponer trazas de error o rutas internas al cliente.</w:t>
       </w:r>
     </w:p>
     <w:p>
@@ -1317,7 +1549,16 @@
           <w:i w:val="0"/>
           <w:color w:val="1F3A5F"/>
         </w:rPr>
-        <w:t>Restricciones de cumplimiento</w:t>
+        <w:t>4. Puertas de revisión humanas</w:t>
+      </w:r>
+    </w:p>
+    <w:p>
+      <w:r>
+        <w:rPr>
+          <w:b w:val="0"/>
+          <w:i w:val="0"/>
+        </w:rPr>
+        <w:t>La IA propone y el humano decide. Ninguna fase avanza sin la aprobación que se indica:</w:t>
       </w:r>
     </w:p>
     <w:tbl>
@@ -1328,13 +1569,15 @@
         <w:tblLook w:firstColumn="1" w:firstRow="1" w:lastColumn="0" w:lastRow="0" w:noHBand="0" w:noVBand="1" w:val="04A0"/>
       </w:tblPr>
       <w:tblGrid>
-        <w:gridCol w:w="4873"/>
-        <w:gridCol w:w="4873"/>
+        <w:gridCol w:w="2436"/>
+        <w:gridCol w:w="2436"/>
+        <w:gridCol w:w="2436"/>
+        <w:gridCol w:w="2436"/>
       </w:tblGrid>
       <w:tr>
         <w:tc>
           <w:tcPr>
-            <w:tcW w:type="dxa" w:w="4873"/>
+            <w:tcW w:type="dxa" w:w="2436"/>
             <w:shd w:val="clear" w:color="auto" w:fill="1F3A5F"/>
           </w:tcPr>
           <w:p>
@@ -1345,13 +1588,13 @@
                 <w:color w:val="FFFFFF"/>
                 <w:sz w:val="19"/>
               </w:rPr>
-              <w:t>Área</w:t>
+              <w:t>Puerta</w:t>
             </w:r>
           </w:p>
         </w:tc>
         <w:tc>
           <w:tcPr>
-            <w:tcW w:type="dxa" w:w="4873"/>
+            <w:tcW w:type="dxa" w:w="2436"/>
             <w:shd w:val="clear" w:color="auto" w:fill="1F3A5F"/>
           </w:tcPr>
           <w:p>
@@ -1362,7 +1605,41 @@
                 <w:color w:val="FFFFFF"/>
                 <w:sz w:val="19"/>
               </w:rPr>
-              <w:t>Restricción</w:t>
+              <w:t>Artefacto</w:t>
+            </w:r>
+          </w:p>
+        </w:tc>
+        <w:tc>
+          <w:tcPr>
+            <w:tcW w:type="dxa" w:w="2436"/>
+            <w:shd w:val="clear" w:color="auto" w:fill="1F3A5F"/>
+          </w:tcPr>
+          <w:p>
+            <w:r>
+              <w:rPr>
+                <w:b/>
+                <w:i w:val="0"/>
+                <w:color w:val="FFFFFF"/>
+                <w:sz w:val="19"/>
+              </w:rPr>
+              <w:t>Aprueba</w:t>
+            </w:r>
+          </w:p>
+        </w:tc>
+        <w:tc>
+          <w:tcPr>
+            <w:tcW w:type="dxa" w:w="2436"/>
+            <w:shd w:val="clear" w:color="auto" w:fill="1F3A5F"/>
+          </w:tcPr>
+          <w:p>
+            <w:r>
+              <w:rPr>
+                <w:b/>
+                <w:i w:val="0"/>
+                <w:color w:val="FFFFFF"/>
+                <w:sz w:val="19"/>
+              </w:rPr>
+              <w:t>Criterio</w:t>
             </w:r>
           </w:p>
         </w:tc>
@@ -1370,7 +1647,7 @@
       <w:tr>
         <w:tc>
           <w:tcPr>
-            <w:tcW w:type="dxa" w:w="4873"/>
+            <w:tcW w:type="dxa" w:w="2436"/>
           </w:tcPr>
           <w:p>
             <w:r>
@@ -1379,13 +1656,30 @@
                 <w:i w:val="0"/>
                 <w:sz w:val="19"/>
               </w:rPr>
-              <w:t>Plataforma</w:t>
+              <w:t>G0</w:t>
             </w:r>
           </w:p>
         </w:tc>
         <w:tc>
           <w:tcPr>
-            <w:tcW w:type="dxa" w:w="4873"/>
+            <w:tcW w:type="dxa" w:w="2436"/>
+          </w:tcPr>
+          <w:p>
+            <w:r>
+              <w:rPr>
+                <w:rFonts w:ascii="Consolas" w:hAnsi="Consolas"/>
+                <w:b w:val="0"/>
+                <w:i w:val="0"/>
+                <w:color w:val="B03060"/>
+                <w:sz w:val="19"/>
+              </w:rPr>
+              <w:t>constitution.md</w:t>
+            </w:r>
+          </w:p>
+        </w:tc>
+        <w:tc>
+          <w:tcPr>
+            <w:tcW w:type="dxa" w:w="2436"/>
           </w:tcPr>
           <w:p>
             <w:r>
@@ -1394,7 +1688,22 @@
                 <w:i w:val="0"/>
                 <w:sz w:val="19"/>
               </w:rPr>
-              <w:t>Node.js ≥ 20 LTS, multiplataforma (Windows/Linux/macOS)</w:t>
+              <w:t>Equipo</w:t>
+            </w:r>
+          </w:p>
+        </w:tc>
+        <w:tc>
+          <w:tcPr>
+            <w:tcW w:type="dxa" w:w="2436"/>
+          </w:tcPr>
+          <w:p>
+            <w:r>
+              <w:rPr>
+                <w:b w:val="0"/>
+                <w:i w:val="0"/>
+                <w:sz w:val="19"/>
+              </w:rPr>
+              <w:t>Consenso</w:t>
             </w:r>
           </w:p>
         </w:tc>
@@ -1402,7 +1711,7 @@
       <w:tr>
         <w:tc>
           <w:tcPr>
-            <w:tcW w:type="dxa" w:w="4873"/>
+            <w:tcW w:type="dxa" w:w="2436"/>
             <w:shd w:val="clear" w:color="auto" w:fill="EEF2F7"/>
           </w:tcPr>
           <w:p>
@@ -1412,13 +1721,39 @@
                 <w:i w:val="0"/>
                 <w:sz w:val="19"/>
               </w:rPr>
-              <w:t>Persistencia</w:t>
+              <w:t>G1</w:t>
             </w:r>
           </w:p>
         </w:tc>
         <w:tc>
           <w:tcPr>
-            <w:tcW w:type="dxa" w:w="4873"/>
+            <w:tcW w:type="dxa" w:w="2436"/>
+            <w:shd w:val="clear" w:color="auto" w:fill="EEF2F7"/>
+          </w:tcPr>
+          <w:p>
+            <w:r>
+              <w:rPr>
+                <w:rFonts w:ascii="Consolas" w:hAnsi="Consolas"/>
+                <w:b w:val="0"/>
+                <w:i w:val="0"/>
+                <w:color w:val="B03060"/>
+                <w:sz w:val="19"/>
+              </w:rPr>
+              <w:t>spec.md</w:t>
+            </w:r>
+            <w:r>
+              <w:rPr>
+                <w:b w:val="0"/>
+                <w:i w:val="0"/>
+                <w:sz w:val="19"/>
+              </w:rPr>
+              <w:t xml:space="preserve"> (requisitos)</w:t>
+            </w:r>
+          </w:p>
+        </w:tc>
+        <w:tc>
+          <w:tcPr>
+            <w:tcW w:type="dxa" w:w="2436"/>
             <w:shd w:val="clear" w:color="auto" w:fill="EEF2F7"/>
           </w:tcPr>
           <w:p>
@@ -1428,47 +1763,13 @@
                 <w:i w:val="0"/>
                 <w:sz w:val="19"/>
               </w:rPr>
-              <w:t>Archivo JSON local con escritura atómica (archivo temporal + rename)</w:t>
-            </w:r>
-          </w:p>
-        </w:tc>
-      </w:tr>
-      <w:tr>
-        <w:tc>
-          <w:tcPr>
-            <w:tcW w:type="dxa" w:w="4873"/>
-          </w:tcPr>
-          <w:p>
-            <w:r>
-              <w:rPr>
-                <w:b w:val="0"/>
-                <w:i w:val="0"/>
-                <w:sz w:val="19"/>
-              </w:rPr>
-              <w:t>Privacidad</w:t>
+              <w:t>Product Owner</w:t>
             </w:r>
           </w:p>
         </w:tc>
         <w:tc>
           <w:tcPr>
-            <w:tcW w:type="dxa" w:w="4873"/>
-          </w:tcPr>
-          <w:p>
-            <w:r>
-              <w:rPr>
-                <w:b w:val="0"/>
-                <w:i w:val="0"/>
-                <w:sz w:val="19"/>
-              </w:rPr>
-              <w:t>No se recolectan datos personales en la iteración 1 (sin usuarios)</w:t>
-            </w:r>
-          </w:p>
-        </w:tc>
-      </w:tr>
-      <w:tr>
-        <w:tc>
-          <w:tcPr>
-            <w:tcW w:type="dxa" w:w="4873"/>
+            <w:tcW w:type="dxa" w:w="2436"/>
             <w:shd w:val="clear" w:color="auto" w:fill="EEF2F7"/>
           </w:tcPr>
           <w:p>
@@ -1478,13 +1779,87 @@
                 <w:i w:val="0"/>
                 <w:sz w:val="19"/>
               </w:rPr>
-              <w:t>Licencia</w:t>
+              <w:t>Checklist de §15 de la guía (requisitos)</w:t>
+            </w:r>
+          </w:p>
+        </w:tc>
+      </w:tr>
+      <w:tr>
+        <w:tc>
+          <w:tcPr>
+            <w:tcW w:type="dxa" w:w="2436"/>
+          </w:tcPr>
+          <w:p>
+            <w:r>
+              <w:rPr>
+                <w:b w:val="0"/>
+                <w:i w:val="0"/>
+                <w:sz w:val="19"/>
+              </w:rPr>
+              <w:t>G2</w:t>
             </w:r>
           </w:p>
         </w:tc>
         <w:tc>
           <w:tcPr>
-            <w:tcW w:type="dxa" w:w="4873"/>
+            <w:tcW w:type="dxa" w:w="2436"/>
+          </w:tcPr>
+          <w:p>
+            <w:r>
+              <w:rPr>
+                <w:rFonts w:ascii="Consolas" w:hAnsi="Consolas"/>
+                <w:b w:val="0"/>
+                <w:i w:val="0"/>
+                <w:color w:val="B03060"/>
+                <w:sz w:val="19"/>
+              </w:rPr>
+              <w:t>plan.md</w:t>
+            </w:r>
+            <w:r>
+              <w:rPr>
+                <w:b w:val="0"/>
+                <w:i w:val="0"/>
+                <w:sz w:val="19"/>
+              </w:rPr>
+              <w:t xml:space="preserve"> (diseño)</w:t>
+            </w:r>
+          </w:p>
+        </w:tc>
+        <w:tc>
+          <w:tcPr>
+            <w:tcW w:type="dxa" w:w="2436"/>
+          </w:tcPr>
+          <w:p>
+            <w:r>
+              <w:rPr>
+                <w:b w:val="0"/>
+                <w:i w:val="0"/>
+                <w:sz w:val="19"/>
+              </w:rPr>
+              <w:t>Líder técnico</w:t>
+            </w:r>
+          </w:p>
+        </w:tc>
+        <w:tc>
+          <w:tcPr>
+            <w:tcW w:type="dxa" w:w="2436"/>
+          </w:tcPr>
+          <w:p>
+            <w:r>
+              <w:rPr>
+                <w:b w:val="0"/>
+                <w:i w:val="0"/>
+                <w:sz w:val="19"/>
+              </w:rPr>
+              <w:t>Checklist de diseño</w:t>
+            </w:r>
+          </w:p>
+        </w:tc>
+      </w:tr>
+      <w:tr>
+        <w:tc>
+          <w:tcPr>
+            <w:tcW w:type="dxa" w:w="2436"/>
             <w:shd w:val="clear" w:color="auto" w:fill="EEF2F7"/>
           </w:tcPr>
           <w:p>
@@ -1494,15 +1869,32 @@
                 <w:i w:val="0"/>
                 <w:sz w:val="19"/>
               </w:rPr>
-              <w:t>MIT</w:t>
+              <w:t>G3</w:t>
             </w:r>
           </w:p>
         </w:tc>
-      </w:tr>
-      <w:tr>
         <w:tc>
           <w:tcPr>
-            <w:tcW w:type="dxa" w:w="4873"/>
+            <w:tcW w:type="dxa" w:w="2436"/>
+            <w:shd w:val="clear" w:color="auto" w:fill="EEF2F7"/>
+          </w:tcPr>
+          <w:p>
+            <w:r>
+              <w:rPr>
+                <w:rFonts w:ascii="Consolas" w:hAnsi="Consolas"/>
+                <w:b w:val="0"/>
+                <w:i w:val="0"/>
+                <w:color w:val="B03060"/>
+                <w:sz w:val="19"/>
+              </w:rPr>
+              <w:t>tasks.md</w:t>
+            </w:r>
+          </w:p>
+        </w:tc>
+        <w:tc>
+          <w:tcPr>
+            <w:tcW w:type="dxa" w:w="2436"/>
+            <w:shd w:val="clear" w:color="auto" w:fill="EEF2F7"/>
           </w:tcPr>
           <w:p>
             <w:r>
@@ -1511,13 +1903,14 @@
                 <w:i w:val="0"/>
                 <w:sz w:val="19"/>
               </w:rPr>
-              <w:t>Idioma</w:t>
+              <w:t>Líder técnico</w:t>
             </w:r>
           </w:p>
         </w:tc>
         <w:tc>
           <w:tcPr>
-            <w:tcW w:type="dxa" w:w="4873"/>
+            <w:tcW w:type="dxa" w:w="2436"/>
+            <w:shd w:val="clear" w:color="auto" w:fill="EEF2F7"/>
           </w:tcPr>
           <w:p>
             <w:r>
@@ -1526,7 +1919,143 @@
                 <w:i w:val="0"/>
                 <w:sz w:val="19"/>
               </w:rPr>
-              <w:t>Documentación y mensajes de error en español</w:t>
+              <w:t>Checklist de tareas</w:t>
+            </w:r>
+          </w:p>
+        </w:tc>
+      </w:tr>
+      <w:tr>
+        <w:tc>
+          <w:tcPr>
+            <w:tcW w:type="dxa" w:w="2436"/>
+          </w:tcPr>
+          <w:p>
+            <w:r>
+              <w:rPr>
+                <w:b w:val="0"/>
+                <w:i w:val="0"/>
+                <w:sz w:val="19"/>
+              </w:rPr>
+              <w:t>G4</w:t>
+            </w:r>
+          </w:p>
+        </w:tc>
+        <w:tc>
+          <w:tcPr>
+            <w:tcW w:type="dxa" w:w="2436"/>
+          </w:tcPr>
+          <w:p>
+            <w:r>
+              <w:rPr>
+                <w:b w:val="0"/>
+                <w:i w:val="0"/>
+                <w:sz w:val="19"/>
+              </w:rPr>
+              <w:t>Implementación</w:t>
+            </w:r>
+          </w:p>
+        </w:tc>
+        <w:tc>
+          <w:tcPr>
+            <w:tcW w:type="dxa" w:w="2436"/>
+          </w:tcPr>
+          <w:p>
+            <w:r>
+              <w:rPr>
+                <w:b w:val="0"/>
+                <w:i w:val="0"/>
+                <w:sz w:val="19"/>
+              </w:rPr>
+              <w:t>Revisor de código</w:t>
+            </w:r>
+          </w:p>
+        </w:tc>
+        <w:tc>
+          <w:tcPr>
+            <w:tcW w:type="dxa" w:w="2436"/>
+          </w:tcPr>
+          <w:p>
+            <w:r>
+              <w:rPr>
+                <w:b w:val="0"/>
+                <w:i w:val="0"/>
+                <w:sz w:val="19"/>
+              </w:rPr>
+              <w:t>Pruebas en verde y revisión del diff</w:t>
+            </w:r>
+          </w:p>
+        </w:tc>
+      </w:tr>
+      <w:tr>
+        <w:tc>
+          <w:tcPr>
+            <w:tcW w:type="dxa" w:w="2436"/>
+            <w:shd w:val="clear" w:color="auto" w:fill="EEF2F7"/>
+          </w:tcPr>
+          <w:p>
+            <w:r>
+              <w:rPr>
+                <w:b w:val="0"/>
+                <w:i w:val="0"/>
+                <w:sz w:val="19"/>
+              </w:rPr>
+              <w:t>G5</w:t>
+            </w:r>
+          </w:p>
+        </w:tc>
+        <w:tc>
+          <w:tcPr>
+            <w:tcW w:type="dxa" w:w="2436"/>
+            <w:shd w:val="clear" w:color="auto" w:fill="EEF2F7"/>
+          </w:tcPr>
+          <w:p>
+            <w:r>
+              <w:rPr>
+                <w:b w:val="0"/>
+                <w:i w:val="0"/>
+                <w:sz w:val="19"/>
+              </w:rPr>
+              <w:t>Auditoría / validación</w:t>
+            </w:r>
+          </w:p>
+        </w:tc>
+        <w:tc>
+          <w:tcPr>
+            <w:tcW w:type="dxa" w:w="2436"/>
+            <w:shd w:val="clear" w:color="auto" w:fill="EEF2F7"/>
+          </w:tcPr>
+          <w:p>
+            <w:r>
+              <w:rPr>
+                <w:b w:val="0"/>
+                <w:i w:val="0"/>
+                <w:sz w:val="19"/>
+              </w:rPr>
+              <w:t>Product Owner + QA</w:t>
+            </w:r>
+          </w:p>
+        </w:tc>
+        <w:tc>
+          <w:tcPr>
+            <w:tcW w:type="dxa" w:w="2436"/>
+            <w:shd w:val="clear" w:color="auto" w:fill="EEF2F7"/>
+          </w:tcPr>
+          <w:p>
+            <w:r>
+              <w:rPr>
+                <w:b w:val="0"/>
+                <w:i w:val="0"/>
+                <w:sz w:val="19"/>
+              </w:rPr>
+              <w:t xml:space="preserve">Checklist de cierre y estado </w:t>
+            </w:r>
+            <w:r>
+              <w:rPr>
+                <w:b/>
+                <w:i w:val="0"/>
+                <w:sz w:val="19"/>
+              </w:rPr>
+              <w:t>CONVERGED</w:t>
             </w:r>
           </w:p>
         </w:tc>
@@ -1543,7 +2072,7 @@
           <w:i w:val="0"/>
           <w:color w:val="1F3A5F"/>
         </w:rPr>
-        <w:t>Flujo de trabajo y calidad (Definition of Done)</w:t>
+        <w:t>5. Instrucciones para el agente de IA</w:t>
       </w:r>
     </w:p>
     <w:p>
@@ -1552,21 +2081,66 @@
           <w:b w:val="0"/>
           <w:i w:val="0"/>
         </w:rPr>
-        <w:t xml:space="preserve">Una iteración se considera </w:t>
+        <w:t xml:space="preserve">Están en </w:t>
+      </w:r>
+      <w:r>
+        <w:rPr>
+          <w:rFonts w:ascii="Consolas" w:hAnsi="Consolas"/>
+          <w:b w:val="0"/>
+          <w:i w:val="0"/>
+          <w:color w:val="B03060"/>
+        </w:rPr>
+        <w:t>AGENTS.md</w:t>
+      </w:r>
+      <w:r>
+        <w:rPr>
+          <w:b w:val="0"/>
+          <w:i w:val="0"/>
+        </w:rPr>
+        <w:t xml:space="preserve"> y </w:t>
+      </w:r>
+      <w:r>
+        <w:rPr>
+          <w:rFonts w:ascii="Consolas" w:hAnsi="Consolas"/>
+          <w:b w:val="0"/>
+          <w:i w:val="0"/>
+          <w:color w:val="B03060"/>
+        </w:rPr>
+        <w:t>CLAUDE.md</w:t>
+      </w:r>
+      <w:r>
+        <w:rPr>
+          <w:b w:val="0"/>
+          <w:i w:val="0"/>
+        </w:rPr>
+        <w:t xml:space="preserve">. En resumen: leer la constitución y la spec de la funcionalidad, implementar </w:t>
       </w:r>
       <w:r>
         <w:rPr>
           <w:b/>
           <w:i w:val="0"/>
         </w:rPr>
-        <w:t>terminada</w:t>
+        <w:t>solo</w:t>
       </w:r>
       <w:r>
         <w:rPr>
           <w:b w:val="0"/>
           <w:i w:val="0"/>
         </w:rPr>
-        <w:t xml:space="preserve"> cuando:</w:t>
+        <w:t xml:space="preserve"> la tarea indicada, ejecutar las pruebas, marcar la tarea y detenerse si algo contradice la spec.</w:t>
+      </w:r>
+    </w:p>
+    <w:p>
+      <w:pPr>
+        <w:pStyle w:val="Heading2"/>
+      </w:pPr>
+      <w:r>
+        <w:rPr>
+          <w:b w:val="0"/>
+          <w:i w:val="0"/>
+          <w:color w:val="1F3A5F"/>
+        </w:rPr>
+        <w:t>6. Definición de "Terminado" (Definition of Done)</w:t>
       </w:r>
     </w:p>
     <w:p>
@@ -1610,7 +2184,7 @@
           <w:b w:val="0"/>
           <w:i w:val="0"/>
         </w:rPr>
-        <w:t>.</w:t>
+        <w:t xml:space="preserve"> y cumplen su "Hecho cuando…".</w:t>
       </w:r>
     </w:p>
     <w:p>
@@ -1664,23 +2238,45 @@
           <w:b w:val="0"/>
           <w:i w:val="0"/>
         </w:rPr>
-        <w:t>El reporte de auditoría (</w:t>
+        <w:t>Cada requisito (FR/NFR) tiene al menos una prueba que lleva su ID en el nombre.</w:t>
+      </w:r>
+    </w:p>
+    <w:p>
+      <w:pPr>
+        <w:pStyle w:val="ListNumber"/>
+      </w:pPr>
+      <w:r>
+        <w:rPr>
+          <w:b w:val="0"/>
+          <w:i w:val="0"/>
+        </w:rPr>
+        <w:t xml:space="preserve">La spec refleja el comportamiento final (no hay </w:t>
       </w:r>
       <w:r>
         <w:rPr>
-          <w:rFonts w:ascii="Consolas" w:hAnsi="Consolas"/>
           <w:b w:val="0"/>
-          <w:i w:val="0"/>
-          <w:color w:val="B03060"/>
+          <w:i/>
         </w:rPr>
-        <w:t>/speckit-converge</w:t>
+        <w:t>spec drift</w:t>
       </w:r>
       <w:r>
         <w:rPr>
           <w:b w:val="0"/>
           <w:i w:val="0"/>
         </w:rPr>
-        <w:t xml:space="preserve"> / coverage) indica estado </w:t>
+        <w:t>).</w:t>
+      </w:r>
+    </w:p>
+    <w:p>
+      <w:pPr>
+        <w:pStyle w:val="ListNumber"/>
+      </w:pPr>
+      <w:r>
+        <w:rPr>
+          <w:b w:val="0"/>
+          <w:i w:val="0"/>
+        </w:rPr>
+        <w:t xml:space="preserve">La auditoría indica estado </w:t>
       </w:r>
       <w:r>
         <w:rPr>
@@ -1694,19 +2290,7 @@
           <w:b w:val="0"/>
           <w:i w:val="0"/>
         </w:rPr>
-        <w:t xml:space="preserve"> sin hallazgos críticos abiertos.</w:t>
-      </w:r>
-    </w:p>
-    <w:p>
-      <w:pPr>
-        <w:pStyle w:val="ListNumber"/>
-      </w:pPr>
-      <w:r>
-        <w:rPr>
-          <w:b w:val="0"/>
-          <w:i w:val="0"/>
-        </w:rPr>
-        <w:t>Cada requisito funcional de la especificación tiene al menos una prueba trazable.</w:t>
+        <w:t>, sin hallazgos críticos ni mayores abiertos.</w:t>
       </w:r>
     </w:p>
     <w:p>
@@ -1719,7 +2303,7 @@
           <w:i w:val="0"/>
           <w:color w:val="1F3A5F"/>
         </w:rPr>
-        <w:t>Gobernanza</w:t>
+        <w:t>7. Gobernanza</w:t>
       </w:r>
     </w:p>
     <w:p>
@@ -1731,7 +2315,7 @@
           <w:b w:val="0"/>
           <w:i w:val="0"/>
         </w:rPr>
-        <w:t xml:space="preserve">Esta constitución está </w:t>
+        <w:t xml:space="preserve">La constitución está </w:t>
       </w:r>
       <w:r>
         <w:rPr>
@@ -1745,7 +2329,7 @@
           <w:b w:val="0"/>
           <w:i w:val="0"/>
         </w:rPr>
-        <w:t xml:space="preserve"> de cualquier otra práctica o instrucción del proyecto.</w:t>
+        <w:t xml:space="preserve"> de cualquier otra práctica del proyecto.</w:t>
       </w:r>
     </w:p>
     <w:p>
@@ -1764,7 +2348,7 @@
           <w:b w:val="0"/>
           <w:i w:val="0"/>
         </w:rPr>
-        <w:t xml:space="preserve"> se proponen por escrito, se justifican, se aprueban por el equipo y se versionan según SemVer (MAYOR: elimina o redefine un principio; MENOR: agrega un principio; PARCHE: aclaraciones).</w:t>
+        <w:t xml:space="preserve"> se proponen por escrito, se aprueban en G0 y se versionan con SemVer (MAYOR: elimina o redefine un principio; MENOR: agrega uno; PARCHE: aclaraciones).</w:t>
       </w:r>
     </w:p>
     <w:p>
@@ -1773,24 +2357,34 @@
       </w:pPr>
       <w:r>
         <w:rPr>
-          <w:b w:val="0"/>
-          <w:i w:val="0"/>
-        </w:rPr>
-        <w:t xml:space="preserve">En la fase de convergencia, el agente debe verificar el cumplimiento de </w:t>
-      </w:r>
-      <w:r>
-        <w:rPr>
           <w:b/>
           <w:i w:val="0"/>
         </w:rPr>
-        <w:t>cada</w:t>
+        <w:t>Historial:</w:t>
       </w:r>
+    </w:p>
+    <w:p>
+      <w:pPr>
+        <w:pStyle w:val="ListBullet2"/>
+      </w:pPr>
       <w:r>
         <w:rPr>
           <w:b w:val="0"/>
           <w:i w:val="0"/>
         </w:rPr>
-        <w:t xml:space="preserve"> principio y reportar las desviaciones.</w:t>
+        <w:t>1.0.0 (2026-10-21): versión inicial.</w:t>
+      </w:r>
+    </w:p>
+    <w:p>
+      <w:pPr>
+        <w:pStyle w:val="ListBullet2"/>
+      </w:pPr>
+      <w:r>
+        <w:rPr>
+          <w:b w:val="0"/>
+          <w:i w:val="0"/>
+        </w:rPr>
+        <w:t>1.1.0 (2026-10-22): se agregan el nivel de rigor, el stack, la lista de prohibiciones, las puertas de revisión y la trazabilidad en los nombres de las pruebas.</w:t>
       </w:r>
     </w:p>
     <w:sectPr>

</xml_diff>